<commit_message>
Refresh portfolio content and resumes
- Fix BillEase spelling across the site
- Reposition as AI-native frontend engineer (Vue/Nuxt + Python)
- Rewrite experience with current BillEase work; add Credit Line and design-token case studies
- Align Remote Classroom and Panoply.io cards with actual work; drop vendor name from liveness card
- Build frontend and full-stack resume variants from one script
- Update footer year; show project name on thumbnails without images

Co-Authored-By: Claude Opus 5.5 <noreply@anthropic.com>
Claude-Session: https://claude.ai/code/session_01LZTD6VJkD1TQerAHndVhy5
</commit_message>
<xml_diff>
--- a/public/XCResume-vue-frontend.docx
+++ b/public/XCResume-vue-frontend.docx
@@ -2,107 +2,119 @@
 <file path=word/document.xml><?xml version="1.0" encoding="utf-8"?>
 <w:document xmlns:wpc="http://schemas.microsoft.com/office/word/2010/wordprocessingCanvas" xmlns:mo="http://schemas.microsoft.com/office/mac/office/2008/main" xmlns:mc="http://schemas.openxmlformats.org/markup-compatibility/2006" xmlns:mv="urn:schemas-microsoft-com:mac:vml" xmlns:o="urn:schemas-microsoft-com:office:office" xmlns:r="http://schemas.openxmlformats.org/officeDocument/2006/relationships" xmlns:m="http://schemas.openxmlformats.org/officeDocument/2006/math" xmlns:v="urn:schemas-microsoft-com:vml" xmlns:wp14="http://schemas.microsoft.com/office/word/2010/wordprocessingDrawing" xmlns:wp="http://schemas.openxmlformats.org/drawingml/2006/wordprocessingDrawing" xmlns:w10="urn:schemas-microsoft-com:office:word" xmlns:w="http://schemas.openxmlformats.org/wordprocessingml/2006/main" xmlns:w14="http://schemas.microsoft.com/office/word/2010/wordml" xmlns:wpg="http://schemas.microsoft.com/office/word/2010/wordprocessingGroup" xmlns:wpi="http://schemas.microsoft.com/office/word/2010/wordprocessingInk" xmlns:wne="http://schemas.microsoft.com/office/word/2006/wordml" xmlns:wps="http://schemas.microsoft.com/office/word/2010/wordprocessingShape" mc:Ignorable="w14 wp14">
   <w:body>
+    <w:tbl>
+      <w:tblPr>
+        <w:tblW w:type="auto" w:w="0"/>
+        <w:tblLook w:firstColumn="1" w:firstRow="1" w:lastColumn="0" w:lastRow="0" w:noHBand="0" w:noVBand="1" w:val="04A0"/>
+      </w:tblPr>
+      <w:tblGrid>
+        <w:gridCol w:w="5112"/>
+        <w:gridCol w:w="5112"/>
+      </w:tblGrid>
+      <w:tr>
+        <w:tc>
+          <w:tcPr>
+            <w:tcW w:type="dxa" w:w="1872"/>
+          </w:tcPr>
+          <w:p>
+            <w:r>
+              <w:drawing>
+                <wp:inline xmlns:a="http://schemas.openxmlformats.org/drawingml/2006/main" xmlns:pic="http://schemas.openxmlformats.org/drawingml/2006/picture">
+                  <wp:extent cx="1005840" cy="1005840"/>
+                  <wp:docPr id="1" name="Picture 1"/>
+                  <wp:cNvGraphicFramePr>
+                    <a:graphicFrameLocks noChangeAspect="1"/>
+                  </wp:cNvGraphicFramePr>
+                  <a:graphic>
+                    <a:graphicData uri="http://schemas.openxmlformats.org/drawingml/2006/picture">
+                      <pic:pic>
+                        <pic:nvPicPr>
+                          <pic:cNvPr id="0" name="image.jpg"/>
+                          <pic:cNvPicPr/>
+                        </pic:nvPicPr>
+                        <pic:blipFill>
+                          <a:blip r:embed="rId9"/>
+                          <a:stretch>
+                            <a:fillRect/>
+                          </a:stretch>
+                        </pic:blipFill>
+                        <pic:spPr>
+                          <a:xfrm>
+                            <a:off x="0" y="0"/>
+                            <a:ext cx="1005840" cy="1005840"/>
+                          </a:xfrm>
+                          <a:prstGeom prst="rect"/>
+                        </pic:spPr>
+                      </pic:pic>
+                    </a:graphicData>
+                  </a:graphic>
+                </wp:inline>
+              </w:drawing>
+            </w:r>
+          </w:p>
+        </w:tc>
+        <w:tc>
+          <w:tcPr>
+            <w:tcW w:type="dxa" w:w="8352"/>
+          </w:tcPr>
+          <w:p>
+            <w:r>
+              <w:rPr>
+                <w:b/>
+                <w:sz w:val="36"/>
+              </w:rPr>
+              <w:t>Exiequielle John Frias (XC)</w:t>
+            </w:r>
+          </w:p>
+          <w:p>
+            <w:r>
+              <w:rPr>
+                <w:color w:val="4C1D95"/>
+                <w:sz w:val="23"/>
+              </w:rPr>
+              <w:t>AI-Native Frontend Engineer  |  Vue, Nuxt, TypeScript</w:t>
+            </w:r>
+          </w:p>
+          <w:p>
+            <w:r>
+              <w:rPr>
+                <w:sz w:val="18"/>
+              </w:rPr>
+              <w:t>Manila, Philippines  |  frias.exiequiellejohn@gmail.com  |  xcworks.vercel.app  |  linkedin.com/in/exiequielle-john  |  github.com/jagwaw</w:t>
+            </w:r>
+          </w:p>
+        </w:tc>
+      </w:tr>
+    </w:tbl>
     <w:p>
       <w:pPr>
-        <w:jc w:val="center"/>
-      </w:pPr>
-      <w:r>
-        <w:drawing>
-          <wp:inline xmlns:a="http://schemas.openxmlformats.org/drawingml/2006/main" xmlns:pic="http://schemas.openxmlformats.org/drawingml/2006/picture">
-            <wp:extent cx="1828800" cy="1828800"/>
-            <wp:docPr id="1" name="Picture 1"/>
-            <wp:cNvGraphicFramePr>
-              <a:graphicFrameLocks noChangeAspect="1"/>
-            </wp:cNvGraphicFramePr>
-            <a:graphic>
-              <a:graphicData uri="http://schemas.openxmlformats.org/drawingml/2006/picture">
-                <pic:pic>
-                  <pic:nvPicPr>
-                    <pic:cNvPr id="0" name="image.jpg"/>
-                    <pic:cNvPicPr/>
-                  </pic:nvPicPr>
-                  <pic:blipFill>
-                    <a:blip r:embed="rId9"/>
-                    <a:stretch>
-                      <a:fillRect/>
-                    </a:stretch>
-                  </pic:blipFill>
-                  <pic:spPr>
-                    <a:xfrm>
-                      <a:off x="0" y="0"/>
-                      <a:ext cx="1828800" cy="1828800"/>
-                    </a:xfrm>
-                    <a:prstGeom prst="rect"/>
-                  </pic:spPr>
-                </pic:pic>
-              </a:graphicData>
-            </a:graphic>
-          </wp:inline>
-        </w:drawing>
-      </w:r>
-    </w:p>
-    <w:p>
-      <w:pPr>
-        <w:jc w:val="center"/>
+        <w:spacing w:before="160" w:after="40"/>
       </w:pPr>
       <w:r>
         <w:rPr>
           <w:b/>
-          <w:sz w:val="32"/>
-        </w:rPr>
-        <w:t>Exiequielle John Frias (XC)</w:t>
-      </w:r>
-    </w:p>
-    <w:p>
-      <w:pPr>
-        <w:jc w:val="center"/>
-      </w:pPr>
-      <w:r>
-        <w:rPr>
-          <w:sz w:val="24"/>
-        </w:rPr>
-        <w:t>Vue.js Developer</w:t>
-      </w:r>
-    </w:p>
-    <w:p>
-      <w:pPr>
-        <w:jc w:val="center"/>
-      </w:pPr>
-      <w:r>
-        <w:rPr>
-          <w:sz w:val="20"/>
-        </w:rPr>
-        <w:t>Manila, Philippines  |  frias.exiequiellejohn@gmail.com  |  linkedin.com/in/exiequielle-john  |  github.com/jagwaw</w:t>
-      </w:r>
-    </w:p>
-    <w:p/>
-    <w:p>
-      <w:pPr>
-        <w:spacing w:before="200" w:after="80"/>
-      </w:pPr>
-      <w:r>
-        <w:rPr>
-          <w:b/>
-          <w:sz w:val="22"/>
+          <w:color w:val="4C1D95"/>
+          <w:sz w:val="21"/>
         </w:rPr>
         <w:t>SUMMARY</w:t>
       </w:r>
     </w:p>
     <w:p>
       <w:r>
-        <w:t>Vue.js developer with 8+ years building responsive, production-grade web applications for fintech and SaaS products serving thousands of daily users. Deep experience with Vue, Vuex, Vue Router, TypeScript, SCSS, and Webpack-based builds. Comfortable owning features from user stories through peer review, real-time UI, performance tuning, and production support.</w:t>
+        <w:t>Frontend-leaning engineer with 8+ years shipping production web apps. At BillEase, a Philippine fintech, I build KYC, payments, and credit products in Vue/Nuxt and TypeScript: I replaced a biometric vendor with an in-house liveness pipeline, led the frontend of a new credit line product, and drove a Figma-driven design-token migration. I build with Claude Code, Cursor, and MCP every day, and I'm comfortable in Python APIs when a feature spans the stack.</w:t>
       </w:r>
     </w:p>
     <w:p>
       <w:pPr>
-        <w:spacing w:before="200" w:after="80"/>
+        <w:spacing w:before="160" w:after="40"/>
       </w:pPr>
       <w:r>
         <w:rPr>
           <w:b/>
-          <w:sz w:val="22"/>
+          <w:color w:val="4C1D95"/>
+          <w:sz w:val="21"/>
         </w:rPr>
-        <w:t>TECHNICAL SKILLS</w:t>
+        <w:t>SKILLS</w:t>
       </w:r>
     </w:p>
     <w:p>
@@ -113,7 +125,7 @@
         <w:t xml:space="preserve">Frontend: </w:t>
       </w:r>
       <w:r>
-        <w:t>Vue.js, Vuex, Vue Router, Vuetify, Nuxt.js 2 &amp; 3, TypeScript, JavaScript (ES6+), SCSS/SASS, Webpack, Firebase, Tailwind CSS, responsive UI, WebSocket, PWA, GSAP</w:t>
+        <w:t>Vue.js, Nuxt.js 2 &amp; 3, TypeScript, JavaScript (ES6+), Vuex, Vue Router, Tailwind CSS, SCSS, Vuetify, Firebase, WebSocket, React</w:t>
       </w:r>
     </w:p>
     <w:p>
@@ -121,10 +133,32 @@
         <w:rPr>
           <w:b/>
         </w:rPr>
-        <w:t xml:space="preserve">Practices: </w:t>
+        <w:t xml:space="preserve">AI-assisted dev: </w:t>
       </w:r>
       <w:r>
-        <w:t>Agile ceremonies, peer code review, user-story delivery, UX-focused iteration, production incident response, mentoring junior developers</w:t>
+        <w:t>Claude Code, Cursor, MCP (Figma, ClickUp), spec-driven agentic workflows</w:t>
+      </w:r>
+    </w:p>
+    <w:p>
+      <w:r>
+        <w:rPr>
+          <w:b/>
+        </w:rPr>
+        <w:t xml:space="preserve">Web performance: </w:t>
+      </w:r>
+      <w:r>
+        <w:t>Technical SEO, Core Web Vitals, Google Analytics, Dynatrace, A/B testing</w:t>
+      </w:r>
+    </w:p>
+    <w:p>
+      <w:r>
+        <w:rPr>
+          <w:b/>
+        </w:rPr>
+        <w:t xml:space="preserve">Backend: </w:t>
+      </w:r>
+      <w:r>
+        <w:t>Python, Django REST Framework, FastAPI, Flask, PostgreSQL, REST APIs</w:t>
       </w:r>
     </w:p>
     <w:p>
@@ -135,242 +169,299 @@
         <w:t xml:space="preserve">Tools: </w:t>
       </w:r>
       <w:r>
-        <w:t>Git, Figma, Postman, JIRA, Confluence, Bitbucket, ClickUp, Cursor, Claude, ChatGPT</w:t>
+        <w:t>Git, GitLab CI, Docker, Figma, Postman, JIRA, ClickUp</w:t>
+      </w:r>
+    </w:p>
+    <w:p>
+      <w:pPr>
+        <w:spacing w:before="160" w:after="40"/>
+      </w:pPr>
+      <w:r>
+        <w:rPr>
+          <w:b/>
+          <w:color w:val="4C1D95"/>
+          <w:sz w:val="21"/>
+        </w:rPr>
+        <w:t>EXPERIENCE</w:t>
+      </w:r>
+    </w:p>
+    <w:p>
+      <w:pPr>
+        <w:spacing w:before="100"/>
+      </w:pPr>
+      <w:r>
+        <w:rPr>
+          <w:b/>
+        </w:rPr>
+        <w:t>Software Engineer  |  BillEase</w:t>
+      </w:r>
+      <w:r>
+        <w:rPr>
+          <w:i/>
+        </w:rPr>
+        <w:t xml:space="preserve">    Feb 2024 - Present</w:t>
       </w:r>
     </w:p>
     <w:p>
       <w:r>
         <w:rPr>
-          <w:b/>
+          <w:i/>
+          <w:sz w:val="18"/>
         </w:rPr>
-        <w:t xml:space="preserve">Backend familiarity: </w:t>
-      </w:r>
-      <w:r>
-        <w:t>Python, Django REST Framework, Django Channels, Redis, Celery, REST APIs, PostgreSQL</w:t>
+        <w:t>Consumer lending and payments app for a Philippine fintech. Nuxt, Vue, TypeScript, Vuex, Tailwind, Python.</w:t>
       </w:r>
     </w:p>
     <w:p>
       <w:pPr>
-        <w:spacing w:before="200" w:after="80"/>
+        <w:pStyle w:val="ListBullet"/>
+        <w:spacing w:after="20"/>
+      </w:pPr>
+      <w:r>
+        <w:t>Core contributor to the consumer lending web app: 3,400+ commits across KYC onboarding, payments, and credit products.</w:t>
+      </w:r>
+    </w:p>
+    <w:p>
+      <w:pPr>
+        <w:pStyle w:val="ListBullet"/>
+        <w:spacing w:after="20"/>
+      </w:pPr>
+      <w:r>
+        <w:t>Replaced a third-party biometric liveness vendor with an in-house detection pipeline (face detection, pose gating, remotely tunable thresholds), removing a per-verification vendor cost.</w:t>
+      </w:r>
+    </w:p>
+    <w:p>
+      <w:pPr>
+        <w:pStyle w:val="ListBullet"/>
+        <w:spacing w:after="20"/>
+      </w:pPr>
+      <w:r>
+        <w:t>Led the frontend build of a new Credit Line product: activation, funding-source selection, OTP-gated payments, statements, and deep-link entry points across four purchase flows.</w:t>
+      </w:r>
+    </w:p>
+    <w:p>
+      <w:pPr>
+        <w:pStyle w:val="ListBullet"/>
+        <w:spacing w:after="20"/>
+      </w:pPr>
+      <w:r>
+        <w:t>Redesigned Account Recovery end to end, adding invisible bot protection with a fallback challenge and security telemetry.</w:t>
+      </w:r>
+    </w:p>
+    <w:p>
+      <w:pPr>
+        <w:pStyle w:val="ListBullet"/>
+        <w:spacing w:after="20"/>
+      </w:pPr>
+      <w:r>
+        <w:t>Drove the migration from an ad-hoc color palette to a Figma-driven design-token system (TypeScript -&gt; CSS variables -&gt; Tailwind), ending years of style drift.</w:t>
+      </w:r>
+    </w:p>
+    <w:p>
+      <w:pPr>
+        <w:pStyle w:val="ListBullet"/>
+        <w:spacing w:after="20"/>
+      </w:pPr>
+      <w:r>
+        <w:t>Owned the design refresh across payments, notifications, e-wallet, auto-renew, and Pay Now.</w:t>
+      </w:r>
+    </w:p>
+    <w:p>
+      <w:pPr>
+        <w:pStyle w:val="ListBullet"/>
+        <w:spacing w:after="20"/>
+      </w:pPr>
+      <w:r>
+        <w:t>Built client-side image compression for KYC uploads so large phone photos no longer fail, with a legibility floor that keeps documents readable for reviewers.</w:t>
+      </w:r>
+    </w:p>
+    <w:p>
+      <w:pPr>
+        <w:pStyle w:val="ListBullet"/>
+        <w:spacing w:after="20"/>
+      </w:pPr>
+      <w:r>
+        <w:t>Introduced the team's change-spec practice (proposal, task checklist, and implementation record per feature), now the standard for new work.</w:t>
+      </w:r>
+    </w:p>
+    <w:p>
+      <w:pPr>
+        <w:spacing w:before="100"/>
       </w:pPr>
       <w:r>
         <w:rPr>
           <w:b/>
-          <w:sz w:val="22"/>
         </w:rPr>
-        <w:t>PROFESSIONAL EXPERIENCE</w:t>
+        <w:t>Frontend Developer  |  Penbrothers (Client: Gamesys / Bally's)</w:t>
+      </w:r>
+      <w:r>
+        <w:rPr>
+          <w:i/>
+        </w:rPr>
+        <w:t xml:space="preserve">    Oct 2021 - Jan 2024</w:t>
       </w:r>
     </w:p>
     <w:p>
       <w:r>
         <w:rPr>
-          <w:b/>
+          <w:i/>
+          <w:sz w:val="18"/>
         </w:rPr>
-        <w:t>Billlease — Full Stack Developer (Vue/Nuxt focus)</w:t>
-      </w:r>
-    </w:p>
-    <w:p>
-      <w:pPr>
-        <w:spacing w:after="40"/>
-      </w:pPr>
-      <w:r>
-        <w:t>Feb 2024 – Present</w:t>
+        <w:t>Customer-facing websites for a global online gaming company, with European and US teams.</w:t>
       </w:r>
     </w:p>
     <w:p>
       <w:pPr>
         <w:pStyle w:val="ListBullet"/>
+        <w:spacing w:after="20"/>
       </w:pPr>
       <w:r>
-        <w:t>Ship responsive Vue/Nuxt + Vuetify interfaces for Billlease fintech flows used by thousands of daily end-users</w:t>
+        <w:t>Built and maintained responsive, mobile-first interfaces for high-traffic gaming sites.</w:t>
       </w:r>
     </w:p>
     <w:p>
       <w:pPr>
         <w:pStyle w:val="ListBullet"/>
+        <w:spacing w:after="20"/>
       </w:pPr>
       <w:r>
-        <w:t>Refactored Vuex state for sign-up, account recovery, and verification journeys</w:t>
+        <w:t>Owned technical SEO: fixed site speed, mobile responsiveness, and crawlability issues, and reported SEO performance to the team.</w:t>
       </w:r>
     </w:p>
     <w:p>
       <w:pPr>
         <w:pStyle w:val="ListBullet"/>
+        <w:spacing w:after="20"/>
       </w:pPr>
       <w:r>
-        <w:t>Built real-time Chat Notification UI and verification flows with WebSocket-backed updates</w:t>
+        <w:t>Set up Google Analytics and Dynatrace, built KPI dashboards, and shipped fixes for bottlenecks found in real-user data.</w:t>
       </w:r>
     </w:p>
     <w:p>
       <w:pPr>
         <w:pStyle w:val="ListBullet"/>
+        <w:spacing w:after="20"/>
       </w:pPr>
       <w:r>
-        <w:t>Integrate Firebase (App Check, client SDK) in production Billlease Nuxt applications</w:t>
+        <w:t>Analyzed A/B test results to recommend improvements; wrote unit tests and took part in code reviews across time zones.</w:t>
+      </w:r>
+    </w:p>
+    <w:p>
+      <w:pPr>
+        <w:spacing w:before="100"/>
+      </w:pPr>
+      <w:r>
+        <w:rPr>
+          <w:b/>
+        </w:rPr>
+        <w:t>Python Developer  |  NarraSoft (Client: Panoply.io)</w:t>
+      </w:r>
+      <w:r>
+        <w:rPr>
+          <w:i/>
+        </w:rPr>
+        <w:t xml:space="preserve">    May 2021 - Oct 2021</w:t>
+      </w:r>
+    </w:p>
+    <w:p>
+      <w:r>
+        <w:rPr>
+          <w:i/>
+          <w:sz w:val="18"/>
+        </w:rPr>
+        <w:t>Cloud data warehouse platform.</w:t>
       </w:r>
     </w:p>
     <w:p>
       <w:pPr>
         <w:pStyle w:val="ListBullet"/>
+        <w:spacing w:after="20"/>
       </w:pPr>
       <w:r>
-        <w:t>Partnered with product owners on user stories, grooming, demos, and peer code reviews</w:t>
+        <w:t>Fixed bugs and improved existing features across the platform's Python codebase.</w:t>
       </w:r>
     </w:p>
     <w:p>
       <w:pPr>
         <w:pStyle w:val="ListBullet"/>
+        <w:spacing w:after="20"/>
       </w:pPr>
       <w:r>
-        <w:t>Diagnosed and resolved production UI issues across mobile and desktop breakpoints</w:t>
+        <w:t>Debugged and maintained data source integrations pulling from third-party providers.</w:t>
+      </w:r>
+    </w:p>
+    <w:p>
+      <w:pPr>
+        <w:spacing w:before="100"/>
+      </w:pPr>
+      <w:r>
+        <w:rPr>
+          <w:b/>
+        </w:rPr>
+        <w:t>Junior Full-Stack Developer  |  Remote Staff</w:t>
+      </w:r>
+      <w:r>
+        <w:rPr>
+          <w:i/>
+        </w:rPr>
+        <w:t xml:space="preserve">    Jul 2018 - May 2021</w:t>
+      </w:r>
+    </w:p>
+    <w:p>
+      <w:r>
+        <w:rPr>
+          <w:i/>
+          <w:sz w:val="18"/>
+        </w:rPr>
+        <w:t>Internal products for a remote staffing company, working directly with the business team and Australian clients.</w:t>
       </w:r>
     </w:p>
     <w:p>
       <w:pPr>
         <w:pStyle w:val="ListBullet"/>
+        <w:spacing w:after="20"/>
       </w:pPr>
       <w:r>
-        <w:t>Delivered Bills Upload AI UI, Pay Now Installments UI, FOMO, and Mobile Load Promo features</w:t>
-      </w:r>
-    </w:p>
-    <w:p>
-      <w:r>
-        <w:rPr>
-          <w:b/>
-        </w:rPr>
-        <w:t>Penbrothers (Client: Gamesys / Bally's) — Frontend Developer</w:t>
-      </w:r>
-    </w:p>
-    <w:p>
-      <w:pPr>
-        <w:spacing w:after="40"/>
-      </w:pPr>
-      <w:r>
-        <w:t>Oct 2021 – Jan 2024</w:t>
+        <w:t>Built Remote Classroom end to end: a pandemic-era platform for schools with student activity tracking, screen capture, time tracking, and task management.</w:t>
       </w:r>
     </w:p>
     <w:p>
       <w:pPr>
         <w:pStyle w:val="ListBullet"/>
+        <w:spacing w:after="20"/>
       </w:pPr>
       <w:r>
-        <w:t>Maintained and improved client-facing websites for a global gaming company</w:t>
+        <w:t>Designed and built its REST APIs in Flask with PostgreSQL and SQLAlchemy.</w:t>
       </w:r>
     </w:p>
     <w:p>
       <w:pPr>
         <w:pStyle w:val="ListBullet"/>
+        <w:spacing w:after="20"/>
       </w:pPr>
       <w:r>
-        <w:t>Designed and implemented mobile-first, performance-conscious UI features</w:t>
+        <w:t>Migrated a legacy Python 2.7 API to Python 3.7, rebuilding it on FastAPI.</w:t>
       </w:r>
     </w:p>
     <w:p>
       <w:pPr>
         <w:pStyle w:val="ListBullet"/>
+        <w:spacing w:after="20"/>
       </w:pPr>
       <w:r>
-        <w:t>Collaborated with European and American stakeholders on requirements and frontend delivery</w:t>
+        <w:t>Rebuilt the client-facing candidate page (v2) and built the company's pricing page.</w:t>
       </w:r>
     </w:p>
     <w:p>
       <w:pPr>
-        <w:pStyle w:val="ListBullet"/>
-      </w:pPr>
-      <w:r>
-        <w:t>Participated in sprint planning, reviews, and cross-timezone communication</w:t>
-      </w:r>
-    </w:p>
-    <w:p>
-      <w:r>
-        <w:rPr>
-          <w:b/>
-        </w:rPr>
-        <w:t>Narrasoft (Client: Panoply.io) — Python Developer</w:t>
-      </w:r>
-    </w:p>
-    <w:p>
-      <w:pPr>
-        <w:spacing w:after="40"/>
-      </w:pPr>
-      <w:r>
-        <w:t>May 2021 – Oct 2021</w:t>
-      </w:r>
-    </w:p>
-    <w:p>
-      <w:pPr>
-        <w:pStyle w:val="ListBullet"/>
-      </w:pPr>
-      <w:r>
-        <w:t>Worked on a cloud-based data warehouse platform for an Asia-based client team</w:t>
-      </w:r>
-    </w:p>
-    <w:p>
-      <w:pPr>
-        <w:pStyle w:val="ListBullet"/>
-      </w:pPr>
-      <w:r>
-        <w:t>Created and modified data source integrations from multiple providers</w:t>
-      </w:r>
-    </w:p>
-    <w:p>
-      <w:pPr>
-        <w:pStyle w:val="ListBullet"/>
-      </w:pPr>
-      <w:r>
-        <w:t>Collaborated with stakeholders on requirements, delivery, and technical decisions</w:t>
-      </w:r>
-    </w:p>
-    <w:p>
-      <w:r>
-        <w:rPr>
-          <w:b/>
-        </w:rPr>
-        <w:t>Remote Staff — Junior Full-Stack Developer</w:t>
-      </w:r>
-    </w:p>
-    <w:p>
-      <w:pPr>
-        <w:spacing w:after="40"/>
-      </w:pPr>
-      <w:r>
-        <w:t>Jul 2018 – May 2021</w:t>
-      </w:r>
-    </w:p>
-    <w:p>
-      <w:pPr>
-        <w:pStyle w:val="ListBullet"/>
-      </w:pPr>
-      <w:r>
-        <w:t>Built a remote classroom platform with real-time activity tracking for teachers and students</w:t>
-      </w:r>
-    </w:p>
-    <w:p>
-      <w:pPr>
-        <w:pStyle w:val="ListBullet"/>
-      </w:pPr>
-      <w:r>
-        <w:t>Developed project and task management UIs for clients, staff, teachers, and students</w:t>
-      </w:r>
-    </w:p>
-    <w:p>
-      <w:pPr>
-        <w:pStyle w:val="ListBullet"/>
-      </w:pPr>
-      <w:r>
-        <w:t>Delivered AngularJS + Python apps; collaborated with Australian clients on remote product work</w:t>
-      </w:r>
-    </w:p>
-    <w:p>
-      <w:pPr>
-        <w:spacing w:before="200" w:after="80"/>
+        <w:spacing w:before="160" w:after="40"/>
       </w:pPr>
       <w:r>
         <w:rPr>
           <w:b/>
-          <w:sz w:val="22"/>
+          <w:color w:val="4C1D95"/>
+          <w:sz w:val="21"/>
         </w:rPr>
-        <w:t>EDUCATION</w:t>
+        <w:t>EDUCATION &amp; CERTIFICATIONS</w:t>
       </w:r>
     </w:p>
     <w:p>
@@ -380,15 +471,18 @@
         </w:rPr>
         <w:t>Bachelor of Science in Information Technology</w:t>
       </w:r>
+      <w:r>
+        <w:t xml:space="preserve">  |  Lyceum of the Philippines University - Manila  |  2014 - 2018</w:t>
+      </w:r>
     </w:p>
     <w:p>
       <w:r>
-        <w:t>Lyceum of the Philippines University — Manila  |  2014 – 2018</w:t>
+        <w:t>LinkedIn Learning: React.js Essential Training; React.js: Building an Interface</w:t>
       </w:r>
     </w:p>
     <w:sectPr>
       <w:pgSz w:w="12240" w:h="15840"/>
-      <w:pgMar w:top="1440" w:right="1800" w:bottom="1440" w:left="1800" w:header="720" w:footer="720" w:gutter="0"/>
+      <w:pgMar w:top="864" w:right="1008" w:bottom="864" w:left="1008" w:header="720" w:footer="720" w:gutter="0"/>
       <w:cols w:space="720"/>
       <w:docGrid w:linePitch="360"/>
     </w:sectPr>
@@ -759,6 +853,13 @@
     <w:name w:val="Normal"/>
     <w:qFormat/>
     <w:rsid w:val="00FC693F"/>
+    <w:pPr>
+      <w:spacing w:after="20"/>
+    </w:pPr>
+    <w:rPr>
+      <w:rFonts w:ascii="Calibri" w:hAnsi="Calibri"/>
+      <w:sz w:val="20"/>
+    </w:rPr>
   </w:style>
   <w:style w:type="paragraph" w:styleId="Header">
     <w:name w:val="header"/>

</xml_diff>